<commit_message>
Final Version of report for Assignment4 added
</commit_message>
<xml_diff>
--- a/Assignment4/results/340915149_206216517.docx
+++ b/Assignment4/results/340915149_206216517.docx
@@ -771,25 +771,7 @@
           <w:szCs w:val="22"/>
           <w:lang w:val="en-US"/>
         </w:rPr>
-        <w:t xml:space="preserve"> of the samples. For instance, if it can spot that one sample is fake, it automatically knows the other is real, since their labels in the pair are always the </w:t>
-      </w:r>
-      <w:r>
-        <w:rPr>
-          <w:rFonts w:asciiTheme="minorHAnsi" w:hAnsiTheme="minorHAnsi"/>
-          <w:sz w:val="22"/>
-          <w:szCs w:val="22"/>
-          <w:lang w:val="en-US"/>
-        </w:rPr>
-        <w:t>opposite</w:t>
-      </w:r>
-      <w:r>
-        <w:rPr>
-          <w:rFonts w:asciiTheme="minorHAnsi" w:hAnsiTheme="minorHAnsi"/>
-          <w:sz w:val="22"/>
-          <w:szCs w:val="22"/>
-          <w:lang w:val="en-US"/>
-        </w:rPr>
-        <w:t xml:space="preserve"> of each other.</w:t>
+        <w:t xml:space="preserve"> of the samples. For instance, if it can spot that one sample is fake, it automatically knows the other is real, since their labels in the pair are always the opposite of each other.</w:t>
       </w:r>
       <w:r>
         <w:rPr>
@@ -990,7 +972,7 @@
     </w:p>
     <w:p>
       <w:pPr>
-        <w:ind w:left="360"/>
+        <w:ind w:left="720"/>
         <w:rPr>
           <w:noProof/>
         </w:rPr>
@@ -1025,11 +1007,24 @@
         <w:rPr>
           <w:noProof/>
         </w:rPr>
-        <w:t xml:space="preserve">Loss Function: Binary Cross-Entropy loss (nn.BCELoss) was used, which is a common choice for GANs with sigmoid output in the discriminator. </w:t>
-      </w:r>
-    </w:p>
-    <w:p>
-      <w:pPr>
+        <w:t>Loss Function: Binary Cross-Entropy loss (nn.BCELoss) was used</w:t>
+      </w:r>
+      <w:r>
+        <w:rPr>
+          <w:noProof/>
+        </w:rPr>
+        <w:t>.</w:t>
+      </w:r>
+      <w:r>
+        <w:rPr>
+          <w:noProof/>
+        </w:rPr>
+        <w:t xml:space="preserve"> </w:t>
+      </w:r>
+    </w:p>
+    <w:p>
+      <w:pPr>
+        <w:ind w:left="720"/>
         <w:rPr>
           <w:noProof/>
         </w:rPr>
@@ -2369,8 +2364,9 @@
           <w:szCs w:val="22"/>
           <w:lang w:val="en-US"/>
         </w:rPr>
-        <w:t xml:space="preserve">The cGAN training </w:t>
-      </w:r>
+        <w:t xml:space="preserve">The </w:t>
+      </w:r>
+      <w:proofErr w:type="spellStart"/>
       <w:r>
         <w:rPr>
           <w:rFonts w:asciiTheme="minorHAnsi" w:hAnsiTheme="minorHAnsi" w:cstheme="majorBidi"/>
@@ -2378,8 +2374,9 @@
           <w:szCs w:val="22"/>
           <w:lang w:val="en-US"/>
         </w:rPr>
-        <w:t>achieves similar results</w:t>
-      </w:r>
+        <w:t>cGAN</w:t>
+      </w:r>
+      <w:proofErr w:type="spellEnd"/>
       <w:r>
         <w:rPr>
           <w:rFonts w:asciiTheme="minorHAnsi" w:hAnsiTheme="minorHAnsi" w:cstheme="majorBidi"/>
@@ -2387,7 +2384,45 @@
           <w:szCs w:val="22"/>
           <w:lang w:val="en-US"/>
         </w:rPr>
-        <w:t xml:space="preserve"> to the standard GAN, stabilizing near their theoretical equilibrium values. This indicates the cGAN effectively learned to generate realistic conditional samples, achieving a good balance where the discriminator struggled to differentiate them from real data.</w:t>
+        <w:t xml:space="preserve"> training </w:t>
+      </w:r>
+      <w:r>
+        <w:rPr>
+          <w:rFonts w:asciiTheme="minorHAnsi" w:hAnsiTheme="minorHAnsi" w:cstheme="majorBidi"/>
+          <w:sz w:val="22"/>
+          <w:szCs w:val="22"/>
+          <w:lang w:val="en-US"/>
+        </w:rPr>
+        <w:t>achieves similar results</w:t>
+      </w:r>
+      <w:r>
+        <w:rPr>
+          <w:rFonts w:asciiTheme="minorHAnsi" w:hAnsiTheme="minorHAnsi" w:cstheme="majorBidi"/>
+          <w:sz w:val="22"/>
+          <w:szCs w:val="22"/>
+          <w:lang w:val="en-US"/>
+        </w:rPr>
+        <w:t xml:space="preserve"> to the standard GAN, stabilizing near their theoretical equilibrium values. This indicates the </w:t>
+      </w:r>
+      <w:proofErr w:type="spellStart"/>
+      <w:r>
+        <w:rPr>
+          <w:rFonts w:asciiTheme="minorHAnsi" w:hAnsiTheme="minorHAnsi" w:cstheme="majorBidi"/>
+          <w:sz w:val="22"/>
+          <w:szCs w:val="22"/>
+          <w:lang w:val="en-US"/>
+        </w:rPr>
+        <w:t>cGAN</w:t>
+      </w:r>
+      <w:proofErr w:type="spellEnd"/>
+      <w:r>
+        <w:rPr>
+          <w:rFonts w:asciiTheme="minorHAnsi" w:hAnsiTheme="minorHAnsi" w:cstheme="majorBidi"/>
+          <w:sz w:val="22"/>
+          <w:szCs w:val="22"/>
+          <w:lang w:val="en-US"/>
+        </w:rPr>
+        <w:t xml:space="preserve"> effectively learned to generate realistic conditional samples, achieving a good balance where the discriminator struggled to differentiate them from real data.</w:t>
       </w:r>
     </w:p>
     <w:p>
@@ -2429,7 +2464,21 @@
         <w:rPr>
           <w:rFonts w:cstheme="majorBidi"/>
         </w:rPr>
-        <w:t xml:space="preserve">After training, both the GAN and cGAN models were used to generate synthetic datasets. </w:t>
+        <w:t xml:space="preserve">After training, both the GAN and </w:t>
+      </w:r>
+      <w:proofErr w:type="spellStart"/>
+      <w:r>
+        <w:rPr>
+          <w:rFonts w:cstheme="majorBidi"/>
+        </w:rPr>
+        <w:t>cGAN</w:t>
+      </w:r>
+      <w:proofErr w:type="spellEnd"/>
+      <w:r>
+        <w:rPr>
+          <w:rFonts w:cstheme="majorBidi"/>
+        </w:rPr>
+        <w:t xml:space="preserve"> models were used to generate synthetic datasets. </w:t>
       </w:r>
     </w:p>
     <w:p>
@@ -2463,7 +2512,21 @@
         <w:rPr>
           <w:rFonts w:cstheme="majorBidi"/>
         </w:rPr>
-        <w:t>For the cGAN, a synthetic dataset was generated with requested label ratios identical to those of the original training set.</w:t>
+        <w:t xml:space="preserve">For the </w:t>
+      </w:r>
+      <w:proofErr w:type="spellStart"/>
+      <w:r>
+        <w:rPr>
+          <w:rFonts w:cstheme="majorBidi"/>
+        </w:rPr>
+        <w:t>cGAN</w:t>
+      </w:r>
+      <w:proofErr w:type="spellEnd"/>
+      <w:r>
+        <w:rPr>
+          <w:rFonts w:cstheme="majorBidi"/>
+        </w:rPr>
+        <w:t>, a synthetic dataset was generated with requested label ratios identical to those of the original training set.</w:t>
       </w:r>
     </w:p>
     <w:p>
@@ -2478,7 +2541,7 @@
           <w:noProof/>
         </w:rPr>
         <w:drawing>
-          <wp:anchor distT="0" distB="0" distL="114300" distR="114300" simplePos="0" relativeHeight="251659264" behindDoc="0" locked="0" layoutInCell="1" allowOverlap="1" wp14:anchorId="13FCC05C" wp14:editId="4B797FD6">
+          <wp:anchor distT="0" distB="0" distL="114300" distR="114300" simplePos="0" relativeHeight="251659264" behindDoc="0" locked="0" layoutInCell="1" allowOverlap="1" wp14:anchorId="13FCC05C" wp14:editId="51A368C0">
             <wp:simplePos x="0" y="0"/>
             <wp:positionH relativeFrom="margin">
               <wp:align>center</wp:align>
@@ -2618,20 +2681,117 @@
         <w:rPr>
           <w:rFonts w:cstheme="majorBidi"/>
         </w:rPr>
-        <w:t>For numerical features like 'capital-gain' and 'capital-loss', both GAN and cGAN correctly identified them as mostly zero. However, their generated distributions show taller, narrower peaks at zero, suggesting they might overemphasize zero values and under-represent the sparse, non-zero tails compared to real data.</w:t>
-      </w:r>
-    </w:p>
-    <w:p>
-      <w:pPr>
-        <w:rPr>
-          <w:rFonts w:cstheme="majorBidi"/>
-        </w:rPr>
-      </w:pPr>
-      <w:r>
-        <w:rPr>
-          <w:rFonts w:cstheme="majorBidi"/>
-        </w:rPr>
-        <w:t>Comparison of some numerical features distributions:</w:t>
+        <w:t xml:space="preserve">For numerical features like 'capital-gain' and 'capital-loss', both GAN and </w:t>
+      </w:r>
+      <w:proofErr w:type="spellStart"/>
+      <w:r>
+        <w:rPr>
+          <w:rFonts w:cstheme="majorBidi"/>
+        </w:rPr>
+        <w:t>cGAN</w:t>
+      </w:r>
+      <w:proofErr w:type="spellEnd"/>
+      <w:r>
+        <w:rPr>
+          <w:rFonts w:cstheme="majorBidi"/>
+        </w:rPr>
+        <w:t xml:space="preserve"> correctly identified them as mostly zero. However, their generated distributions show taller, narrower peaks at zero, suggesting they might overemphasize zero values and under-represent the sparse, non-zero tails compared to real data.</w:t>
+      </w:r>
+    </w:p>
+    <w:p>
+      <w:pPr>
+        <w:rPr>
+          <w:rFonts w:cstheme="majorBidi"/>
+        </w:rPr>
+      </w:pPr>
+    </w:p>
+    <w:p>
+      <w:pPr>
+        <w:rPr>
+          <w:rFonts w:cstheme="majorBidi"/>
+        </w:rPr>
+      </w:pPr>
+    </w:p>
+    <w:p>
+      <w:pPr>
+        <w:rPr>
+          <w:rFonts w:cstheme="majorBidi"/>
+        </w:rPr>
+      </w:pPr>
+    </w:p>
+    <w:p>
+      <w:pPr>
+        <w:rPr>
+          <w:rFonts w:cstheme="majorBidi"/>
+        </w:rPr>
+      </w:pPr>
+    </w:p>
+    <w:p>
+      <w:pPr>
+        <w:rPr>
+          <w:rFonts w:cstheme="majorBidi"/>
+        </w:rPr>
+      </w:pPr>
+    </w:p>
+    <w:p>
+      <w:pPr>
+        <w:rPr>
+          <w:rFonts w:cstheme="majorBidi"/>
+        </w:rPr>
+      </w:pPr>
+    </w:p>
+    <w:p>
+      <w:pPr>
+        <w:rPr>
+          <w:rFonts w:cstheme="majorBidi"/>
+        </w:rPr>
+      </w:pPr>
+    </w:p>
+    <w:p>
+      <w:pPr>
+        <w:rPr>
+          <w:rFonts w:cstheme="majorBidi"/>
+        </w:rPr>
+      </w:pPr>
+    </w:p>
+    <w:p>
+      <w:pPr>
+        <w:rPr>
+          <w:rFonts w:cstheme="majorBidi"/>
+        </w:rPr>
+      </w:pPr>
+    </w:p>
+    <w:p>
+      <w:pPr>
+        <w:rPr>
+          <w:rFonts w:cstheme="majorBidi"/>
+        </w:rPr>
+      </w:pPr>
+    </w:p>
+    <w:p>
+      <w:pPr>
+        <w:rPr>
+          <w:rFonts w:cstheme="majorBidi"/>
+        </w:rPr>
+      </w:pPr>
+      <w:r>
+        <w:rPr>
+          <w:rFonts w:cstheme="majorBidi"/>
+        </w:rPr>
+        <w:lastRenderedPageBreak/>
+        <w:t xml:space="preserve">Comparison of some </w:t>
+      </w:r>
+      <w:r>
+        <w:rPr>
+          <w:rFonts w:cstheme="majorBidi"/>
+        </w:rPr>
+        <w:t xml:space="preserve">categorical </w:t>
+      </w:r>
+      <w:r>
+        <w:rPr>
+          <w:rFonts w:cstheme="majorBidi"/>
+        </w:rPr>
+        <w:t>features distributions:</w:t>
       </w:r>
     </w:p>
     <w:p>
@@ -2740,38 +2900,94 @@
         <w:rPr>
           <w:rFonts w:cstheme="majorBidi"/>
         </w:rPr>
-        <w:lastRenderedPageBreak/>
         <w:t>For</w:t>
       </w:r>
       <w:r>
         <w:rPr>
           <w:rFonts w:cstheme="majorBidi"/>
         </w:rPr>
-        <w:t xml:space="preserve"> categorical features, both models effectively replicated the high proportion of the common 'workclass_Private' category. For the rare 'workclass_Without-pay' category, the standard GAN significantly under-represented it. The cGAN performed better, getting closer to the real proportion, but still found it challenging to perfectly match this very infrequent category.</w:t>
-      </w:r>
-    </w:p>
-    <w:p>
-      <w:pPr>
-        <w:rPr>
-          <w:rFonts w:cstheme="majorBidi"/>
-        </w:rPr>
-      </w:pPr>
-      <w:r>
-        <w:rPr>
-          <w:rFonts w:cstheme="majorBidi"/>
-        </w:rPr>
-        <w:t>In summary, while both models capture dominant patterns, they face challenges with the nuances of sparse distributions and accurately replicating very rare categories, with the cGAN showing some advantages in categorical feature generation.</w:t>
-      </w:r>
-    </w:p>
-    <w:p>
-      <w:pPr>
-        <w:rPr>
-          <w:rFonts w:cstheme="majorBidi"/>
-        </w:rPr>
-      </w:pPr>
-      <w:r>
-        <w:rPr>
-          <w:rFonts w:cstheme="majorBidi"/>
+        <w:t xml:space="preserve"> categorical features, both models effectively replicated the high proportion of the common '</w:t>
+      </w:r>
+      <w:proofErr w:type="spellStart"/>
+      <w:r>
+        <w:rPr>
+          <w:rFonts w:cstheme="majorBidi"/>
+        </w:rPr>
+        <w:t>workclass_Private</w:t>
+      </w:r>
+      <w:proofErr w:type="spellEnd"/>
+      <w:r>
+        <w:rPr>
+          <w:rFonts w:cstheme="majorBidi"/>
+        </w:rPr>
+        <w:t>' category. For the rare '</w:t>
+      </w:r>
+      <w:proofErr w:type="spellStart"/>
+      <w:r>
+        <w:rPr>
+          <w:rFonts w:cstheme="majorBidi"/>
+        </w:rPr>
+        <w:t>workclass_Without</w:t>
+      </w:r>
+      <w:proofErr w:type="spellEnd"/>
+      <w:r>
+        <w:rPr>
+          <w:rFonts w:cstheme="majorBidi"/>
+        </w:rPr>
+        <w:t xml:space="preserve">-pay' category, the standard GAN significantly under-represented it. The </w:t>
+      </w:r>
+      <w:proofErr w:type="spellStart"/>
+      <w:r>
+        <w:rPr>
+          <w:rFonts w:cstheme="majorBidi"/>
+        </w:rPr>
+        <w:t>cGAN</w:t>
+      </w:r>
+      <w:proofErr w:type="spellEnd"/>
+      <w:r>
+        <w:rPr>
+          <w:rFonts w:cstheme="majorBidi"/>
+        </w:rPr>
+        <w:t xml:space="preserve"> performed better, getting closer to the real proportion, but still found it challenging to perfectly match this very infrequent category.</w:t>
+      </w:r>
+    </w:p>
+    <w:p>
+      <w:pPr>
+        <w:rPr>
+          <w:rFonts w:cstheme="majorBidi"/>
+        </w:rPr>
+      </w:pPr>
+      <w:r>
+        <w:rPr>
+          <w:rFonts w:cstheme="majorBidi"/>
+        </w:rPr>
+        <w:t xml:space="preserve">In summary, while both models capture dominant patterns, they face challenges with the nuances of sparse distributions and accurately replicating very rare categories, with the </w:t>
+      </w:r>
+      <w:proofErr w:type="spellStart"/>
+      <w:r>
+        <w:rPr>
+          <w:rFonts w:cstheme="majorBidi"/>
+        </w:rPr>
+        <w:t>cGAN</w:t>
+      </w:r>
+      <w:proofErr w:type="spellEnd"/>
+      <w:r>
+        <w:rPr>
+          <w:rFonts w:cstheme="majorBidi"/>
+        </w:rPr>
+        <w:t xml:space="preserve"> showing some advantages in categorical feature generation.</w:t>
+      </w:r>
+    </w:p>
+    <w:p>
+      <w:pPr>
+        <w:rPr>
+          <w:rFonts w:cstheme="majorBidi"/>
+        </w:rPr>
+      </w:pPr>
+      <w:r>
+        <w:rPr>
+          <w:rFonts w:cstheme="majorBidi"/>
+          <w:noProof/>
         </w:rPr>
         <w:drawing>
           <wp:inline distT="0" distB="0" distL="0" distR="0" wp14:anchorId="1E3DBB42" wp14:editId="320DF8BB">
@@ -2820,109 +3036,72 @@
         <w:rPr>
           <w:rFonts w:cstheme="majorBidi"/>
         </w:rPr>
-        <w:t xml:space="preserve">For the correlation matrices, both the standard GAN and </w:t>
-      </w:r>
+        <w:t xml:space="preserve">In the real data, most features are weakly correlated, with a few stronger patterns like the ones between education-num </w:t>
+      </w:r>
+      <w:r>
+        <w:rPr>
+          <w:rFonts w:cstheme="majorBidi"/>
+        </w:rPr>
+        <w:t>and</w:t>
+      </w:r>
+      <w:r>
+        <w:rPr>
+          <w:rFonts w:cstheme="majorBidi"/>
+        </w:rPr>
+        <w:t xml:space="preserve"> hours-per-week. The GAN-generated data doesn’t preserve this structure very well and adds some correlations that don’t </w:t>
+      </w:r>
+      <w:r>
+        <w:rPr>
+          <w:rFonts w:cstheme="majorBidi"/>
+        </w:rPr>
+        <w:t>exist</w:t>
+      </w:r>
+      <w:r>
+        <w:rPr>
+          <w:rFonts w:cstheme="majorBidi"/>
+        </w:rPr>
+        <w:t xml:space="preserve"> in the real data. On the other hand, the </w:t>
+      </w:r>
+      <w:proofErr w:type="spellStart"/>
       <w:r>
         <w:rPr>
           <w:rFonts w:cstheme="majorBidi"/>
         </w:rPr>
         <w:t>cGAN</w:t>
       </w:r>
-      <w:r>
-        <w:rPr>
-          <w:rFonts w:cstheme="majorBidi"/>
-        </w:rPr>
-        <w:t xml:space="preserve"> were effective at learning and preserving the underlying correlation structure of the numerical features. The cGAN model was slightly better</w:t>
-      </w:r>
-      <w:r>
-        <w:rPr>
-          <w:rFonts w:cstheme="majorBidi"/>
-        </w:rPr>
-        <w:t>,</w:t>
-      </w:r>
-      <w:r>
-        <w:rPr>
-          <w:rFonts w:cstheme="majorBidi"/>
-        </w:rPr>
-        <w:t xml:space="preserve"> we can see there is less correlation between features in its generated data. The generated data from both models maintains a key statistical property of the original data, indicating that the models did not introduce spurious relationships between these variables.</w:t>
-      </w:r>
-    </w:p>
-    <w:p>
-      <w:pPr>
-        <w:rPr>
-          <w:rFonts w:cstheme="majorBidi"/>
-        </w:rPr>
-      </w:pPr>
-    </w:p>
-    <w:p>
-      <w:pPr>
-        <w:rPr>
-          <w:rFonts w:cstheme="majorBidi"/>
-        </w:rPr>
-      </w:pPr>
-    </w:p>
-    <w:p>
-      <w:pPr>
-        <w:rPr>
-          <w:rFonts w:cstheme="majorBidi"/>
-        </w:rPr>
-      </w:pPr>
-    </w:p>
-    <w:p>
-      <w:pPr>
-        <w:rPr>
-          <w:rFonts w:cstheme="majorBidi"/>
-        </w:rPr>
-      </w:pPr>
-    </w:p>
-    <w:p>
-      <w:pPr>
-        <w:rPr>
-          <w:rFonts w:cstheme="majorBidi"/>
-        </w:rPr>
-      </w:pPr>
-    </w:p>
-    <w:p>
-      <w:pPr>
-        <w:rPr>
-          <w:rFonts w:cstheme="majorBidi"/>
-        </w:rPr>
-      </w:pPr>
-    </w:p>
-    <w:p>
-      <w:pPr>
-        <w:rPr>
-          <w:rFonts w:cstheme="majorBidi"/>
-        </w:rPr>
-      </w:pPr>
-    </w:p>
-    <w:p>
-      <w:pPr>
-        <w:rPr>
-          <w:rFonts w:cstheme="majorBidi"/>
-        </w:rPr>
-      </w:pPr>
-    </w:p>
-    <w:p>
-      <w:pPr>
-        <w:rPr>
-          <w:rFonts w:cstheme="majorBidi"/>
-        </w:rPr>
-      </w:pPr>
-    </w:p>
-    <w:p>
-      <w:pPr>
-        <w:rPr>
-          <w:rFonts w:cstheme="majorBidi"/>
-        </w:rPr>
-      </w:pPr>
-    </w:p>
-    <w:p>
-      <w:pPr>
-        <w:rPr>
-          <w:rFonts w:cstheme="majorBidi"/>
-        </w:rPr>
-      </w:pPr>
+      <w:proofErr w:type="spellEnd"/>
+      <w:r>
+        <w:rPr>
+          <w:rFonts w:cstheme="majorBidi"/>
+        </w:rPr>
+        <w:t xml:space="preserve"> does a better job of keeping the original relationships between features. Although it's not perfect, the </w:t>
+      </w:r>
+      <w:proofErr w:type="spellStart"/>
+      <w:r>
+        <w:rPr>
+          <w:rFonts w:cstheme="majorBidi"/>
+        </w:rPr>
+        <w:t>cGAN</w:t>
+      </w:r>
+      <w:proofErr w:type="spellEnd"/>
+      <w:r>
+        <w:rPr>
+          <w:rFonts w:cstheme="majorBidi"/>
+        </w:rPr>
+        <w:t xml:space="preserve"> seems to generate data that is more similar to </w:t>
+      </w:r>
+      <w:r>
+        <w:rPr>
+          <w:rFonts w:cstheme="majorBidi"/>
+        </w:rPr>
+        <w:t>real</w:t>
+      </w:r>
+      <w:r>
+        <w:rPr>
+          <w:rFonts w:cstheme="majorBidi"/>
+        </w:rPr>
+        <w:t xml:space="preserve"> data in terms of how the features relate to each other.</w:t>
+      </w:r>
     </w:p>
     <w:p>
       <w:pPr>
@@ -2980,7 +3159,21 @@
         <w:rPr>
           <w:rFonts w:cstheme="majorBidi"/>
         </w:rPr>
-        <w:t>The performance of the GAN and cGAN models was evaluated using detection and efficacy metrics. These evaluations were conducted for three separate experiments, each using a different random seed for the initial train-test split and for any random processes within the evaluation functions themselves</w:t>
+        <w:t xml:space="preserve">The performance of the GAN and </w:t>
+      </w:r>
+      <w:proofErr w:type="spellStart"/>
+      <w:r>
+        <w:rPr>
+          <w:rFonts w:cstheme="majorBidi"/>
+        </w:rPr>
+        <w:t>cGAN</w:t>
+      </w:r>
+      <w:proofErr w:type="spellEnd"/>
+      <w:r>
+        <w:rPr>
+          <w:rFonts w:cstheme="majorBidi"/>
+        </w:rPr>
+        <w:t xml:space="preserve"> models was evaluated using detection and efficacy metrics. These evaluations were conducted for three separate experiments, each using a different random seed for the initial train-test split and for any random processes within the evaluation functions themselves</w:t>
       </w:r>
       <w:r>
         <w:rPr>
@@ -3018,6 +3211,7 @@
       <w:pPr>
         <w:rPr>
           <w:rFonts w:cstheme="majorBidi"/>
+          <w:rtl/>
         </w:rPr>
       </w:pPr>
       <w:r>
@@ -3048,21 +3242,7 @@
         <w:rPr>
           <w:rFonts w:cstheme="majorBidi"/>
         </w:rPr>
-        <w:t xml:space="preserve"> data. A lower score (AUC closer to 0.5) is better, indicating that the synthetic samples are highly </w:t>
-      </w:r>
-      <w:proofErr w:type="gramStart"/>
-      <w:r>
-        <w:rPr>
-          <w:rFonts w:cstheme="majorBidi"/>
-        </w:rPr>
-        <w:t>similar to</w:t>
-      </w:r>
-      <w:proofErr w:type="gramEnd"/>
-      <w:r>
-        <w:rPr>
-          <w:rFonts w:cstheme="majorBidi"/>
-        </w:rPr>
-        <w:t xml:space="preserve"> real samples and thus difficult for a classifier to distinguish. </w:t>
+        <w:t xml:space="preserve"> data. A lower score (AUC closer to 0.5) is better, indicating that the synthetic samples are highly similar to real samples and thus difficult for a classifier to distinguish. </w:t>
       </w:r>
     </w:p>
     <w:p>
@@ -3173,35 +3353,7 @@
         <w:rPr>
           <w:rFonts w:cstheme="majorBidi"/>
         </w:rPr>
-        <w:t xml:space="preserve">The trained classifiers were then evaluated on a test set composed of the remaining </w:t>
-      </w:r>
-      <w:proofErr w:type="gramStart"/>
-      <w:r>
-        <w:rPr>
-          <w:rFonts w:cstheme="majorBidi"/>
-        </w:rPr>
-        <w:t>one fold</w:t>
-      </w:r>
-      <w:proofErr w:type="gramEnd"/>
-      <w:r>
-        <w:rPr>
-          <w:rFonts w:cstheme="majorBidi"/>
-        </w:rPr>
-        <w:t xml:space="preserve"> of real data and </w:t>
-      </w:r>
-      <w:proofErr w:type="gramStart"/>
-      <w:r>
-        <w:rPr>
-          <w:rFonts w:cstheme="majorBidi"/>
-        </w:rPr>
-        <w:t>one fold</w:t>
-      </w:r>
-      <w:proofErr w:type="gramEnd"/>
-      <w:r>
-        <w:rPr>
-          <w:rFonts w:cstheme="majorBidi"/>
-        </w:rPr>
-        <w:t xml:space="preserve"> of synthetic data.</w:t>
+        <w:t>The trained classifiers were then evaluated on a test set composed of the remaining one fold of real data and one fold of synthetic data.</w:t>
       </w:r>
     </w:p>
     <w:p>
@@ -3449,7 +3601,77 @@
         <w:rPr>
           <w:rFonts w:cstheme="majorBidi"/>
         </w:rPr>
-        <w:t xml:space="preserve"> A Random Forest (RF) model was trained on the original training set (X_train_processed, y_train) and evaluated on the original test set (X_test_processed, y_test). The AUC score (AUC_real) was obtained.</w:t>
+        <w:t xml:space="preserve"> A Random Forest (RF) model was trained on the original training set (</w:t>
+      </w:r>
+      <w:proofErr w:type="spellStart"/>
+      <w:r>
+        <w:rPr>
+          <w:rFonts w:cstheme="majorBidi"/>
+        </w:rPr>
+        <w:t>X_train_processed</w:t>
+      </w:r>
+      <w:proofErr w:type="spellEnd"/>
+      <w:r>
+        <w:rPr>
+          <w:rFonts w:cstheme="majorBidi"/>
+        </w:rPr>
+        <w:t xml:space="preserve">, </w:t>
+      </w:r>
+      <w:proofErr w:type="spellStart"/>
+      <w:r>
+        <w:rPr>
+          <w:rFonts w:cstheme="majorBidi"/>
+        </w:rPr>
+        <w:t>y_train</w:t>
+      </w:r>
+      <w:proofErr w:type="spellEnd"/>
+      <w:r>
+        <w:rPr>
+          <w:rFonts w:cstheme="majorBidi"/>
+        </w:rPr>
+        <w:t>) and evaluated on the original test set (</w:t>
+      </w:r>
+      <w:proofErr w:type="spellStart"/>
+      <w:r>
+        <w:rPr>
+          <w:rFonts w:cstheme="majorBidi"/>
+        </w:rPr>
+        <w:t>X_test_processed</w:t>
+      </w:r>
+      <w:proofErr w:type="spellEnd"/>
+      <w:r>
+        <w:rPr>
+          <w:rFonts w:cstheme="majorBidi"/>
+        </w:rPr>
+        <w:t xml:space="preserve">, </w:t>
+      </w:r>
+      <w:proofErr w:type="spellStart"/>
+      <w:r>
+        <w:rPr>
+          <w:rFonts w:cstheme="majorBidi"/>
+        </w:rPr>
+        <w:t>y_test</w:t>
+      </w:r>
+      <w:proofErr w:type="spellEnd"/>
+      <w:r>
+        <w:rPr>
+          <w:rFonts w:cstheme="majorBidi"/>
+        </w:rPr>
+        <w:t>). The AUC score (</w:t>
+      </w:r>
+      <w:proofErr w:type="spellStart"/>
+      <w:r>
+        <w:rPr>
+          <w:rFonts w:cstheme="majorBidi"/>
+        </w:rPr>
+        <w:t>AUC_real</w:t>
+      </w:r>
+      <w:proofErr w:type="spellEnd"/>
+      <w:r>
+        <w:rPr>
+          <w:rFonts w:cstheme="majorBidi"/>
+        </w:rPr>
+        <w:t>) was obtained.</w:t>
       </w:r>
     </w:p>
     <w:p>
@@ -3507,7 +3729,21 @@
         <w:rPr>
           <w:rFonts w:cstheme="majorBidi"/>
         </w:rPr>
-        <w:t>, labels for the synthetic data were predicted using a Random Forest classifier (label_predictor_for_gan) trained on the real processed training data and its true labels. This step is necessary because the standard GAN does not inherently generate labels alongside features for the efficacy task where labels are needed for training the downstream Random Forest.</w:t>
+        <w:t>, labels for the synthetic data were predicted using a Random Forest classifier (</w:t>
+      </w:r>
+      <w:proofErr w:type="spellStart"/>
+      <w:r>
+        <w:rPr>
+          <w:rFonts w:cstheme="majorBidi"/>
+        </w:rPr>
+        <w:t>label_predictor_for_gan</w:t>
+      </w:r>
+      <w:proofErr w:type="spellEnd"/>
+      <w:r>
+        <w:rPr>
+          <w:rFonts w:cstheme="majorBidi"/>
+        </w:rPr>
+        <w:t>) trained on the real processed training data and its true labels. This step is necessary because the standard GAN does not inherently generate labels alongside features for the efficacy task where labels are needed for training the downstream Random Forest.</w:t>
       </w:r>
     </w:p>
     <w:p>
@@ -3527,6 +3763,7 @@
         </w:rPr>
         <w:t xml:space="preserve">For the </w:t>
       </w:r>
+      <w:proofErr w:type="spellStart"/>
       <w:r>
         <w:rPr>
           <w:rFonts w:cstheme="majorBidi"/>
@@ -3535,11 +3772,26 @@
         </w:rPr>
         <w:t>cGAN</w:t>
       </w:r>
-      <w:r>
-        <w:rPr>
-          <w:rFonts w:cstheme="majorBidi"/>
-        </w:rPr>
-        <w:t>, the labels generated alongside the features (synthetic_labels_cgan) were used directly.</w:t>
+      <w:proofErr w:type="spellEnd"/>
+      <w:r>
+        <w:rPr>
+          <w:rFonts w:cstheme="majorBidi"/>
+        </w:rPr>
+        <w:t>, the labels generated alongside the features (</w:t>
+      </w:r>
+      <w:proofErr w:type="spellStart"/>
+      <w:r>
+        <w:rPr>
+          <w:rFonts w:cstheme="majorBidi"/>
+        </w:rPr>
+        <w:t>synthetic_labels_cgan</w:t>
+      </w:r>
+      <w:proofErr w:type="spellEnd"/>
+      <w:r>
+        <w:rPr>
+          <w:rFonts w:cstheme="majorBidi"/>
+        </w:rPr>
+        <w:t>) were used directly.</w:t>
       </w:r>
     </w:p>
     <w:p>
@@ -3557,7 +3809,63 @@
         <w:rPr>
           <w:rFonts w:cstheme="majorBidi"/>
         </w:rPr>
-        <w:t>An RF model was then trained on the respective synthetic dataset (GAN-generated features with predicted labels, or cGAN-generated features with their generated labels) and evaluated on the original test set (X_test_processed, y_test). The AUC score (AUC_synthetic) was obtained.</w:t>
+        <w:t xml:space="preserve">An RF model was then trained on the respective synthetic dataset (GAN-generated features with predicted labels, or </w:t>
+      </w:r>
+      <w:proofErr w:type="spellStart"/>
+      <w:r>
+        <w:rPr>
+          <w:rFonts w:cstheme="majorBidi"/>
+        </w:rPr>
+        <w:t>cGAN</w:t>
+      </w:r>
+      <w:proofErr w:type="spellEnd"/>
+      <w:r>
+        <w:rPr>
+          <w:rFonts w:cstheme="majorBidi"/>
+        </w:rPr>
+        <w:t>-generated features with their generated labels) and evaluated on the original test set (</w:t>
+      </w:r>
+      <w:proofErr w:type="spellStart"/>
+      <w:r>
+        <w:rPr>
+          <w:rFonts w:cstheme="majorBidi"/>
+        </w:rPr>
+        <w:t>X_test_processed</w:t>
+      </w:r>
+      <w:proofErr w:type="spellEnd"/>
+      <w:r>
+        <w:rPr>
+          <w:rFonts w:cstheme="majorBidi"/>
+        </w:rPr>
+        <w:t xml:space="preserve">, </w:t>
+      </w:r>
+      <w:proofErr w:type="spellStart"/>
+      <w:r>
+        <w:rPr>
+          <w:rFonts w:cstheme="majorBidi"/>
+        </w:rPr>
+        <w:t>y_test</w:t>
+      </w:r>
+      <w:proofErr w:type="spellEnd"/>
+      <w:r>
+        <w:rPr>
+          <w:rFonts w:cstheme="majorBidi"/>
+        </w:rPr>
+        <w:t>). The AUC score (</w:t>
+      </w:r>
+      <w:proofErr w:type="spellStart"/>
+      <w:r>
+        <w:rPr>
+          <w:rFonts w:cstheme="majorBidi"/>
+        </w:rPr>
+        <w:t>AUC_synthetic</w:t>
+      </w:r>
+      <w:proofErr w:type="spellEnd"/>
+      <w:r>
+        <w:rPr>
+          <w:rFonts w:cstheme="majorBidi"/>
+        </w:rPr>
+        <w:t>) was obtained.</w:t>
       </w:r>
     </w:p>
     <w:p>
@@ -3583,7 +3891,35 @@
         <w:rPr>
           <w:rFonts w:cstheme="majorBidi"/>
         </w:rPr>
-        <w:t xml:space="preserve"> The efficacy was calculated as AUC_synthetic / AUC_real.</w:t>
+        <w:t xml:space="preserve"> The efficacy was calculated as </w:t>
+      </w:r>
+      <w:proofErr w:type="spellStart"/>
+      <w:r>
+        <w:rPr>
+          <w:rFonts w:cstheme="majorBidi"/>
+        </w:rPr>
+        <w:t>AUC_synthetic</w:t>
+      </w:r>
+      <w:proofErr w:type="spellEnd"/>
+      <w:r>
+        <w:rPr>
+          <w:rFonts w:cstheme="majorBidi"/>
+        </w:rPr>
+        <w:t xml:space="preserve"> / </w:t>
+      </w:r>
+      <w:proofErr w:type="spellStart"/>
+      <w:r>
+        <w:rPr>
+          <w:rFonts w:cstheme="majorBidi"/>
+        </w:rPr>
+        <w:t>AUC_real</w:t>
+      </w:r>
+      <w:proofErr w:type="spellEnd"/>
+      <w:r>
+        <w:rPr>
+          <w:rFonts w:cstheme="majorBidi"/>
+        </w:rPr>
+        <w:t>.</w:t>
       </w:r>
     </w:p>
     <w:p>
@@ -3846,6 +4182,7 @@
                 <w14:ligatures w14:val="none"/>
               </w:rPr>
             </w:pPr>
+            <w:proofErr w:type="spellStart"/>
             <w:r>
               <w:rPr>
                 <w:rFonts w:asciiTheme="minorBidi" w:eastAsia="Times New Roman" w:hAnsiTheme="minorBidi"/>
@@ -3855,6 +4192,7 @@
               </w:rPr>
               <w:t>cGAN</w:t>
             </w:r>
+            <w:proofErr w:type="spellEnd"/>
           </w:p>
         </w:tc>
       </w:tr>
@@ -5704,6 +6042,7 @@
                 <w14:ligatures w14:val="none"/>
               </w:rPr>
             </w:pPr>
+            <w:proofErr w:type="spellStart"/>
             <w:r>
               <w:rPr>
                 <w:rFonts w:asciiTheme="minorBidi" w:eastAsia="Times New Roman" w:hAnsiTheme="minorBidi"/>
@@ -5713,6 +6052,7 @@
               </w:rPr>
               <w:t>cGAN</w:t>
             </w:r>
+            <w:proofErr w:type="spellEnd"/>
           </w:p>
         </w:tc>
       </w:tr>
@@ -6152,6 +6492,7 @@
         </w:rPr>
         <w:t xml:space="preserve"> and </w:t>
       </w:r>
+      <w:proofErr w:type="spellStart"/>
       <w:r>
         <w:rPr>
           <w:rFonts w:cstheme="majorBidi"/>
@@ -6160,6 +6501,7 @@
         </w:rPr>
         <w:t>cGAN</w:t>
       </w:r>
+      <w:proofErr w:type="spellEnd"/>
       <w:r>
         <w:rPr>
           <w:rFonts w:cstheme="majorBidi"/>
@@ -6178,7 +6520,21 @@
         <w:rPr>
           <w:rFonts w:cstheme="majorBidi"/>
         </w:rPr>
-        <w:t>. This indicates that the Random Forest classifier was able to perfectly distinguish synthetic samples from real samples for both models. This suggests that, from the perspective of a relatively complex model like RF, the generated data from both GAN and cGAN still contains discernible differences from the real data.</w:t>
+        <w:t xml:space="preserve">. This indicates that the Random Forest classifier was able to perfectly distinguish synthetic samples from real samples for both models. This suggests that, from the perspective of a relatively complex model like RF, the generated data from both GAN and </w:t>
+      </w:r>
+      <w:proofErr w:type="spellStart"/>
+      <w:r>
+        <w:rPr>
+          <w:rFonts w:cstheme="majorBidi"/>
+        </w:rPr>
+        <w:t>cGAN</w:t>
+      </w:r>
+      <w:proofErr w:type="spellEnd"/>
+      <w:r>
+        <w:rPr>
+          <w:rFonts w:cstheme="majorBidi"/>
+        </w:rPr>
+        <w:t xml:space="preserve"> still contains discernible differences from the real data.</w:t>
       </w:r>
     </w:p>
     <w:p>
@@ -6257,6 +6613,7 @@
         </w:rPr>
         <w:t xml:space="preserve">The </w:t>
       </w:r>
+      <w:proofErr w:type="spellStart"/>
       <w:r>
         <w:rPr>
           <w:rFonts w:cstheme="majorBidi"/>
@@ -6265,6 +6622,7 @@
         </w:rPr>
         <w:t>cGAN</w:t>
       </w:r>
+      <w:proofErr w:type="spellEnd"/>
       <w:r>
         <w:rPr>
           <w:rFonts w:cstheme="majorBidi"/>
@@ -6319,46 +6677,84 @@
         </w:rPr>
         <w:t xml:space="preserve">The </w:t>
       </w:r>
+      <w:proofErr w:type="spellStart"/>
       <w:r>
         <w:rPr>
           <w:rFonts w:cstheme="majorBidi"/>
           <w:b/>
           <w:bCs/>
         </w:rPr>
-        <w:t>cGAN's average AUC (0.6365) is slightly lower than the GAN's (0.6576)</w:t>
-      </w:r>
-      <w:r>
-        <w:rPr>
-          <w:rFonts w:cstheme="majorBidi"/>
-        </w:rPr>
-        <w:t>, suggesting that the cGAN's output might be marginally more difficult for a linear classifier to distinguish from real data than the standard GAN's output. This hints at a slightly higher degree of linear realism in the cGAN samples.</w:t>
-      </w:r>
-    </w:p>
-    <w:p>
-      <w:pPr>
-        <w:rPr>
-          <w:rFonts w:cstheme="majorBidi"/>
-        </w:rPr>
-      </w:pPr>
-      <w:r>
-        <w:rPr>
-          <w:rFonts w:cstheme="majorBidi"/>
-        </w:rPr>
-        <w:t xml:space="preserve">While a powerful classifier (RF) can perfectly separate </w:t>
-      </w:r>
-      <w:proofErr w:type="gramStart"/>
-      <w:r>
-        <w:rPr>
-          <w:rFonts w:cstheme="majorBidi"/>
-        </w:rPr>
-        <w:t>synthetic</w:t>
-      </w:r>
-      <w:proofErr w:type="gramEnd"/>
-      <w:r>
-        <w:rPr>
-          <w:rFonts w:cstheme="majorBidi"/>
-        </w:rPr>
-        <w:t xml:space="preserve"> from real data for both models, a simpler linear classifier (LR) finds it more challenging, with the cGAN data being slightly harder to detect than GAN data.</w:t>
+        <w:t>cGAN's</w:t>
+      </w:r>
+      <w:proofErr w:type="spellEnd"/>
+      <w:r>
+        <w:rPr>
+          <w:rFonts w:cstheme="majorBidi"/>
+          <w:b/>
+          <w:bCs/>
+        </w:rPr>
+        <w:t xml:space="preserve"> average AUC (0.6365) is slightly lower than the GAN's (0.6576)</w:t>
+      </w:r>
+      <w:r>
+        <w:rPr>
+          <w:rFonts w:cstheme="majorBidi"/>
+        </w:rPr>
+        <w:t xml:space="preserve">, suggesting that the </w:t>
+      </w:r>
+      <w:proofErr w:type="spellStart"/>
+      <w:r>
+        <w:rPr>
+          <w:rFonts w:cstheme="majorBidi"/>
+        </w:rPr>
+        <w:t>cGAN's</w:t>
+      </w:r>
+      <w:proofErr w:type="spellEnd"/>
+      <w:r>
+        <w:rPr>
+          <w:rFonts w:cstheme="majorBidi"/>
+        </w:rPr>
+        <w:t xml:space="preserve"> output might be marginally more difficult for a linear classifier to distinguish from real data than the standard GAN's output. This hints at a slightly higher degree of linear realism in the </w:t>
+      </w:r>
+      <w:proofErr w:type="spellStart"/>
+      <w:r>
+        <w:rPr>
+          <w:rFonts w:cstheme="majorBidi"/>
+        </w:rPr>
+        <w:t>cGAN</w:t>
+      </w:r>
+      <w:proofErr w:type="spellEnd"/>
+      <w:r>
+        <w:rPr>
+          <w:rFonts w:cstheme="majorBidi"/>
+        </w:rPr>
+        <w:t xml:space="preserve"> samples.</w:t>
+      </w:r>
+    </w:p>
+    <w:p>
+      <w:pPr>
+        <w:rPr>
+          <w:rFonts w:cstheme="majorBidi"/>
+        </w:rPr>
+      </w:pPr>
+      <w:r>
+        <w:rPr>
+          <w:rFonts w:cstheme="majorBidi"/>
+        </w:rPr>
+        <w:t xml:space="preserve">While a powerful classifier (RF) can perfectly separate synthetic from real data for both models, a simpler linear classifier (LR) finds it more challenging, with the </w:t>
+      </w:r>
+      <w:proofErr w:type="spellStart"/>
+      <w:r>
+        <w:rPr>
+          <w:rFonts w:cstheme="majorBidi"/>
+        </w:rPr>
+        <w:t>cGAN</w:t>
+      </w:r>
+      <w:proofErr w:type="spellEnd"/>
+      <w:r>
+        <w:rPr>
+          <w:rFonts w:cstheme="majorBidi"/>
+        </w:rPr>
+        <w:t xml:space="preserve"> data being slightly harder to detect than GAN data.</w:t>
       </w:r>
     </w:p>
     <w:p>
@@ -6451,13 +6847,23 @@
           <w:rFonts w:cstheme="majorBidi"/>
         </w:rPr>
       </w:pPr>
+      <w:proofErr w:type="spellStart"/>
       <w:r>
         <w:rPr>
           <w:rFonts w:cstheme="majorBidi"/>
           <w:b/>
           <w:bCs/>
         </w:rPr>
-        <w:t>cGAN Efficacy:</w:t>
+        <w:t>cGAN</w:t>
+      </w:r>
+      <w:proofErr w:type="spellEnd"/>
+      <w:r>
+        <w:rPr>
+          <w:rFonts w:cstheme="majorBidi"/>
+          <w:b/>
+          <w:bCs/>
+        </w:rPr>
+        <w:t xml:space="preserve"> Efficacy:</w:t>
       </w:r>
     </w:p>
     <w:p>
@@ -6483,48 +6889,94 @@
           <w:b/>
           <w:bCs/>
         </w:rPr>
-        <w:t>Efficacy (Ratio) for the cGAN is 0.9058</w:t>
-      </w:r>
-      <w:r>
-        <w:rPr>
-          <w:rFonts w:cstheme="majorBidi"/>
-        </w:rPr>
-        <w:t xml:space="preserve">. This means a Random Forest model trained on cGAN-generated data (using its directly generated conditional labels) achieved about </w:t>
-      </w:r>
+        <w:t xml:space="preserve">Efficacy (Ratio) for the </w:t>
+      </w:r>
+      <w:proofErr w:type="spellStart"/>
       <w:r>
         <w:rPr>
           <w:rFonts w:cstheme="majorBidi"/>
           <w:b/>
           <w:bCs/>
         </w:rPr>
-        <w:t>90.58%</w:t>
-      </w:r>
-      <w:r>
-        <w:rPr>
-          <w:rFonts w:cstheme="majorBidi"/>
-        </w:rPr>
-        <w:t xml:space="preserve"> of the performance of a model trained on real data. While still indicating good utility, this is noticeably lower than the GAN's efficacy.</w:t>
-      </w:r>
-    </w:p>
-    <w:p>
-      <w:pPr>
-        <w:rPr>
-          <w:rFonts w:cstheme="majorBidi"/>
-        </w:rPr>
-      </w:pPr>
+        <w:t>cGAN</w:t>
+      </w:r>
+      <w:proofErr w:type="spellEnd"/>
       <w:r>
         <w:rPr>
           <w:rFonts w:cstheme="majorBidi"/>
           <w:b/>
           <w:bCs/>
         </w:rPr>
+        <w:t xml:space="preserve"> is 0.9058</w:t>
+      </w:r>
+      <w:r>
+        <w:rPr>
+          <w:rFonts w:cstheme="majorBidi"/>
+        </w:rPr>
+        <w:t xml:space="preserve">. This means a Random Forest model trained on </w:t>
+      </w:r>
+      <w:proofErr w:type="spellStart"/>
+      <w:r>
+        <w:rPr>
+          <w:rFonts w:cstheme="majorBidi"/>
+        </w:rPr>
+        <w:t>cGAN</w:t>
+      </w:r>
+      <w:proofErr w:type="spellEnd"/>
+      <w:r>
+        <w:rPr>
+          <w:rFonts w:cstheme="majorBidi"/>
+        </w:rPr>
+        <w:t xml:space="preserve">-generated data (using its directly generated conditional labels) achieved about </w:t>
+      </w:r>
+      <w:r>
+        <w:rPr>
+          <w:rFonts w:cstheme="majorBidi"/>
+          <w:b/>
+          <w:bCs/>
+        </w:rPr>
+        <w:t>90.58%</w:t>
+      </w:r>
+      <w:r>
+        <w:rPr>
+          <w:rFonts w:cstheme="majorBidi"/>
+        </w:rPr>
+        <w:t xml:space="preserve"> of the performance of a model trained on real data. While still indicating good utility, this is noticeably lower than the GAN's efficacy.</w:t>
+      </w:r>
+    </w:p>
+    <w:p>
+      <w:pPr>
+        <w:rPr>
+          <w:rFonts w:cstheme="majorBidi"/>
+        </w:rPr>
+      </w:pPr>
+      <w:r>
+        <w:rPr>
+          <w:rFonts w:cstheme="majorBidi"/>
+          <w:b/>
+          <w:bCs/>
+        </w:rPr>
         <w:t>In summary for efficacy:</w:t>
       </w:r>
       <w:r>
         <w:rPr>
           <w:rFonts w:cstheme="majorBidi"/>
         </w:rPr>
-        <w:t xml:space="preserve"> The synthetic data generated by the standard GAN proved to be a more effective substitute for real data in the downstream income prediction task compared to the data generated by the cGAN.</w:t>
+        <w:t xml:space="preserve"> The synthetic data generated by the standard GAN proved to be a more effective substitute for real data in the downstream income prediction task compared to the data generated by the </w:t>
+      </w:r>
+      <w:proofErr w:type="spellStart"/>
+      <w:r>
+        <w:rPr>
+          <w:rFonts w:cstheme="majorBidi"/>
+        </w:rPr>
+        <w:t>cGAN</w:t>
+      </w:r>
+      <w:proofErr w:type="spellEnd"/>
+      <w:r>
+        <w:rPr>
+          <w:rFonts w:cstheme="majorBidi"/>
+        </w:rPr>
+        <w:t>.</w:t>
       </w:r>
     </w:p>
     <w:sectPr>
@@ -16136,6 +16588,7 @@
   <w:style w:type="character" w:default="1" w:styleId="DefaultParagraphFont">
     <w:name w:val="Default Paragraph Font"/>
     <w:uiPriority w:val="1"/>
+    <w:semiHidden/>
     <w:unhideWhenUsed/>
   </w:style>
   <w:style w:type="table" w:default="1" w:styleId="TableNormal">
@@ -16593,6 +17046,82 @@
       <w14:ligatures w14:val="none"/>
     </w:rPr>
   </w:style>
+  <w:style w:type="character" w:styleId="CommentReference">
+    <w:name w:val="annotation reference"/>
+    <w:basedOn w:val="DefaultParagraphFont"/>
+    <w:uiPriority w:val="99"/>
+    <w:semiHidden/>
+    <w:unhideWhenUsed/>
+    <w:rsid w:val="005A689E"/>
+    <w:rPr>
+      <w:sz w:val="16"/>
+      <w:szCs w:val="16"/>
+    </w:rPr>
+  </w:style>
+  <w:style w:type="paragraph" w:styleId="CommentText">
+    <w:name w:val="annotation text"/>
+    <w:basedOn w:val="Normal"/>
+    <w:link w:val="CommentTextChar"/>
+    <w:uiPriority w:val="99"/>
+    <w:unhideWhenUsed/>
+    <w:rsid w:val="005A689E"/>
+    <w:pPr>
+      <w:spacing w:line="240" w:lineRule="auto"/>
+    </w:pPr>
+    <w:rPr>
+      <w:sz w:val="20"/>
+      <w:szCs w:val="20"/>
+    </w:rPr>
+  </w:style>
+  <w:style w:type="character" w:customStyle="1" w:styleId="CommentTextChar">
+    <w:name w:val="Comment Text Char"/>
+    <w:basedOn w:val="DefaultParagraphFont"/>
+    <w:link w:val="CommentText"/>
+    <w:uiPriority w:val="99"/>
+    <w:rsid w:val="005A689E"/>
+    <w:rPr>
+      <w:sz w:val="20"/>
+      <w:szCs w:val="20"/>
+    </w:rPr>
+  </w:style>
+  <w:style w:type="paragraph" w:styleId="CommentSubject">
+    <w:name w:val="annotation subject"/>
+    <w:basedOn w:val="CommentText"/>
+    <w:next w:val="CommentText"/>
+    <w:link w:val="CommentSubjectChar"/>
+    <w:uiPriority w:val="99"/>
+    <w:semiHidden/>
+    <w:unhideWhenUsed/>
+    <w:rsid w:val="005A689E"/>
+    <w:rPr>
+      <w:b/>
+      <w:bCs/>
+    </w:rPr>
+  </w:style>
+  <w:style w:type="character" w:customStyle="1" w:styleId="CommentSubjectChar">
+    <w:name w:val="Comment Subject Char"/>
+    <w:basedOn w:val="CommentTextChar"/>
+    <w:link w:val="CommentSubject"/>
+    <w:uiPriority w:val="99"/>
+    <w:semiHidden/>
+    <w:rsid w:val="005A689E"/>
+    <w:rPr>
+      <w:b/>
+      <w:bCs/>
+      <w:sz w:val="20"/>
+      <w:szCs w:val="20"/>
+    </w:rPr>
+  </w:style>
+  <w:style w:type="paragraph" w:styleId="Revision">
+    <w:name w:val="Revision"/>
+    <w:hidden/>
+    <w:uiPriority w:val="99"/>
+    <w:semiHidden/>
+    <w:rsid w:val="00DC1DFC"/>
+    <w:pPr>
+      <w:spacing w:after="0" w:line="240" w:lineRule="auto"/>
+    </w:pPr>
+  </w:style>
 </w:styles>
 </file>
 

</xml_diff>